<commit_message>
fix final report 20apr
</commit_message>
<xml_diff>
--- a/docs/final_report.docx
+++ b/docs/final_report.docx
@@ -119,7 +119,7 @@
         <w:t xml:space="preserve"> </w:t>
       </w:r>
       <w:r>
-        <w:t xml:space="preserve">18,</w:t>
+        <w:t xml:space="preserve">20,</w:t>
       </w:r>
       <w:r>
         <w:t xml:space="preserve"> </w:t>
@@ -142,7 +142,7 @@
         <w:pStyle w:val="FirstParagraph"/>
       </w:pPr>
       <w:r>
-        <w:t xml:space="preserve">Understanding what employers expect in the analytics job market is not always straightforward, especially for students preparing to enter data-related roles. While there is a large amount of career advice available, it often lacks direct connection to actual hiring data. To address this gap, this project analyzes a dataset of 72,498 job postings from Lightcast, which includes information on job titles, required skills, salaries, and experience levels. Rather than relying on general assumptions, the analysis focuses on identifying patterns directly from observed job market data.</w:t>
+        <w:t xml:space="preserve">This project analyzes job market trends in 2024, focusing on required skills, salary patterns, and industry demand. By analyzing large-scale job posting data, we examine market trends for data-related roles such as data analysts, data scientists, and machine learning engineers, with the goal of understanding the skills and perspectives necessary to become a competitive asset in the labor market. This project explores what skills are most in demand within analytics-related jobs and what factors influence salary levels. Furthermore, it analyzes how to increase market value by identifying the gap between current team capabilities and market expectations. The overarching goal is to identify and evaluate the factors that most meaningfully influence job prospects in the current labor market.</w:t>
       </w:r>
     </w:p>
     <w:p>
@@ -150,7 +150,15 @@
         <w:pStyle w:val="BodyText"/>
       </w:pPr>
       <w:r>
-        <w:t xml:space="preserve">The project is guided by three main questions: (1) What technical and transferable skills are most in demand for analytics-related roles in 2024?, (2) What factors — including experience, education, and location — are most strongly associated with salary, and (3) How can our team’s current skill levels be benchmarked against market expectations to identify meaningful gaps?. To explore these questions, we apply a combination of exploratory data analysis, clustering, regression, and classification methods. The goal is not to provide definitive answers, but to develop a more grounded understanding of current labor market trends and their practical implications.</w:t>
+        <w:t xml:space="preserve">The three central research questions guiding this project are: (1) What technical and transferable skills are most in demand for analytics-related roles in 2024? (2) What factors — including experience, education, and location — are most strongly associated with salary? (3) How can current team skill levels be benchmarked against market expectations to identify meaningful gaps?</w:t>
+      </w:r>
+    </w:p>
+    <w:p>
+      <w:pPr>
+        <w:pStyle w:val="BodyText"/>
+      </w:pPr>
+      <w:r>
+        <w:t xml:space="preserve">This report is organized as follows: Section 2 describes the data source and cleaning process, Section 3 presents exploratory data analysis, Section 4 describes the modeling methods and results, Section 5 analyzes the skill gap between team capabilities and market demands, Section 6 discusses the broader implications of the findings, and Section 7 concludes with practical recommendations. An appendix covering optional NLP analysis is included at the end.</w:t>
       </w:r>
     </w:p>
     <w:bookmarkEnd w:id="20"/>
@@ -169,6 +177,14 @@
       </w:pPr>
       <w:r>
         <w:t xml:space="preserve">This page explains how the Lightcast job-posting dataset was prepared for analysis. The goal is to create a clean and consistent dataset for exploratory analysis, skill comparisons, clustering, regression, and classification.</w:t>
+      </w:r>
+    </w:p>
+    <w:p>
+      <w:pPr>
+        <w:pStyle w:val="BodyText"/>
+      </w:pPr>
+      <w:r>
+        <w:t xml:space="preserve">This dataset consists of 72,498 job listings and 131 variables, including job title, salary range, skills, education level, and industry classification. To ensure usability, data cleaning procedures such as variable selection, column naming standardization, handling of missing values, and salary normalization were applied. These transformations enable more effective exploration analysis and modeling.</w:t>
       </w:r>
     </w:p>
     <w:bookmarkStart w:id="21" w:name="data-source"/>
@@ -12273,12 +12289,78 @@
       </w:r>
     </w:p>
     <w:bookmarkEnd w:id="71"/>
-    <w:bookmarkStart w:id="91" w:name="skill-gap-analysis"/>
+    <w:bookmarkStart w:id="72" w:name="results"/>
     <w:p>
       <w:pPr>
         <w:pStyle w:val="Heading2"/>
       </w:pPr>
       <w:r>
+        <w:t xml:space="preserve">Results</w:t>
+      </w:r>
+    </w:p>
+    <w:p>
+      <w:pPr>
+        <w:pStyle w:val="FirstParagraph"/>
+      </w:pPr>
+      <w:r>
+        <w:t xml:space="preserve">The following section summarizes the key findings across all analytical methods applied in this project and connects them back to the three central research questions.</w:t>
+      </w:r>
+      <w:r>
+        <w:t xml:space="preserve"> </w:t>
+      </w:r>
+      <w:r>
+        <w:t xml:space="preserve">What the Clustering Told Us</w:t>
+      </w:r>
+      <w:r>
+        <w:t xml:space="preserve"> </w:t>
+      </w:r>
+      <w:r>
+        <w:t xml:space="preserve">When we let the data group itself, it split into two clusters rather than several distinct role types. Cluster 0 had 2,673 postings and Cluster 1 had 1,265. Both groups were dominated by Mathematical Science Occupations, which was somewhat surprising — we expected to see cleaner separation between, say, data analysts and machine learning engineers. Instead, what the clustering really captured was a divide between earlier-career and more senior profiles, based on salary and experience levels. The takeaway is that the analytics job market is less about rigid categories and more about where you are in your career journey.</w:t>
+      </w:r>
+      <w:r>
+        <w:t xml:space="preserve"> </w:t>
+      </w:r>
+      <w:r>
+        <w:t xml:space="preserve">What Drives Salary — and What Doesn’t</w:t>
+      </w:r>
+      <w:r>
+        <w:t xml:space="preserve"> </w:t>
+      </w:r>
+      <w:r>
+        <w:t xml:space="preserve">The regression model explained about 32% of salary variation (R² = 0.323, RMSE = $38,660), which is moderate but not surprising given how many intangible factors go into compensation. What stood out most clearly was experience — minimum years of experience had a correlation of r = 0.49 with annual salary, and maximum experience r = 0.53. The median salary for analytics roles landed at $120,000, with most roles falling somewhere between $90,000 and $150,000. Location and occupation group also contributed, but experience was the single clearest lever. This directly answers our second research question: if you want to increase your salary, investing in real hands-on experience is the most reliable path.</w:t>
+      </w:r>
+      <w:r>
+        <w:t xml:space="preserve"> </w:t>
+      </w:r>
+      <w:r>
+        <w:t xml:space="preserve">How Well Can We Identify an Analytics Role</w:t>
+      </w:r>
+      <w:r>
+        <w:t xml:space="preserve"> </w:t>
+      </w:r>
+      <w:r>
+        <w:t xml:space="preserve">The classification model performed remarkably well — 98.7% accuracy and an F1 score of 0.993. Out of nearly 14,500 test cases, only 12 actual analytics roles were missed. This tells us that analytics roles have a very recognizable structural profile: the combination of occupation group, sector, and job features is enough to identify them with near-certainty. For job seekers, this means that how you position yourself — the titles you use, the sectors you target — matters a lot in how you show up in searches and employer pipelines.</w:t>
+      </w:r>
+      <w:r>
+        <w:t xml:space="preserve"> </w:t>
+      </w:r>
+      <w:r>
+        <w:t xml:space="preserve">Where the Real Skill Gaps Are — and Why It Matters</w:t>
+      </w:r>
+      <w:r>
+        <w:t xml:space="preserve"> </w:t>
+      </w:r>
+      <w:r>
+        <w:t xml:space="preserve">Looking at the 63,406 analytics-related postings, Python and SQL came up again and again across every skill category. Cloud computing, machine learning, and Tableau followed closely. When compared to where our team currently stands, the gaps were clear: Python at a beginner-to-intermediate level, cloud tools like AWS essentially starting from scratch, and machine learning still in early stages. These are the exact skills tied to the higher-paying roles in the dataset. The answer to our third research question is straightforward — the most important thing we can do to close the distance between where we are and where the market expects us to be is to prioritize Python, cloud, and machine learning. Not because a checklist says so, but because the data shows those are the skills that actually move the needle on both employability and compensation.</w:t>
+      </w:r>
+    </w:p>
+    <w:bookmarkEnd w:id="72"/>
+    <w:bookmarkStart w:id="92" w:name="skill-gap-analysis"/>
+    <w:p>
+      <w:pPr>
+        <w:pStyle w:val="Heading2"/>
+      </w:pPr>
+      <w:r>
         <w:t xml:space="preserve">Skill Gap Analysis</w:t>
       </w:r>
     </w:p>
@@ -12287,10 +12369,10 @@
         <w:pStyle w:val="FirstParagraph"/>
       </w:pPr>
       <w:r>
-        <w:t xml:space="preserve">This page examines which skills appear most often in analytics-related job postings and what those patterns suggest for students preparing for business analytics, data science, and machine learning careers. The goal is to compare market demand with the types of skills that job seekers may need to strengthen.</w:t>
-      </w:r>
-    </w:p>
-    <w:bookmarkStart w:id="72" w:name="load-cleaned-data-2"/>
+        <w:t xml:space="preserve">This page examines which skills appear most often in analytics-related job postings and what those patterns suggest for students preparing for business analytics, data science, and machine learning careers. The goal is to compare market demand with the types of skills that job seekers may need to strengthen. This analysis identified several gaps between the skills sought after in the market and the current skills of the team. While programming skills such as Python and SQL are particularly important, as well as cloud technologies (such as AWS), the team’s experience in these areas is limited. Advanced skills in machine learning and data engineering are also in high demand, and strengthening these skills will be essential for improving competitiveness in the future.</w:t>
+      </w:r>
+    </w:p>
+    <w:bookmarkStart w:id="73" w:name="load-cleaned-data-2"/>
     <w:p>
       <w:pPr>
         <w:pStyle w:val="Heading3"/>
@@ -12411,8 +12493,8 @@
         <w:t xml:space="preserve">(72498, 28)</w:t>
       </w:r>
     </w:p>
-    <w:bookmarkEnd w:id="72"/>
-    <w:bookmarkStart w:id="73" w:name="focus-on-analytics-related-roles"/>
+    <w:bookmarkEnd w:id="73"/>
+    <w:bookmarkStart w:id="74" w:name="focus-on-analytics-related-roles"/>
     <w:p>
       <w:pPr>
         <w:pStyle w:val="Heading3"/>
@@ -12508,8 +12590,8 @@
         <w:t xml:space="preserve">(63406, 28)</w:t>
       </w:r>
     </w:p>
-    <w:bookmarkEnd w:id="73"/>
-    <w:bookmarkStart w:id="77" w:name="most-common-specialized-skills"/>
+    <w:bookmarkEnd w:id="74"/>
+    <w:bookmarkStart w:id="78" w:name="most-common-specialized-skills"/>
     <w:p>
       <w:pPr>
         <w:pStyle w:val="Heading3"/>
@@ -13027,18 +13109,18 @@
           <wp:inline>
             <wp:extent cx="5334000" cy="6027227"/>
             <wp:effectExtent b="0" l="0" r="0" t="0"/>
-            <wp:docPr descr="" title="" id="75" name="Picture"/>
+            <wp:docPr descr="" title="" id="76" name="Picture"/>
             <a:graphic>
               <a:graphicData uri="http://schemas.openxmlformats.org/drawingml/2006/picture">
                 <pic:pic>
                   <pic:nvPicPr>
-                    <pic:cNvPr descr="final_report_files/figure-docx/cell-38-output-1.png" id="76" name="Picture"/>
+                    <pic:cNvPr descr="final_report_files/figure-docx/cell-38-output-1.png" id="77" name="Picture"/>
                     <pic:cNvPicPr>
                       <a:picLocks noChangeArrowheads="1" noChangeAspect="1"/>
                     </pic:cNvPicPr>
                   </pic:nvPicPr>
                   <pic:blipFill>
-                    <a:blip r:embed="rId74"/>
+                    <a:blip r:embed="rId75"/>
                     <a:stretch>
                       <a:fillRect/>
                     </a:stretch>
@@ -13065,8 +13147,8 @@
         </w:drawing>
       </w:r>
     </w:p>
-    <w:bookmarkEnd w:id="77"/>
-    <w:bookmarkStart w:id="81" w:name="most-common-software-skills"/>
+    <w:bookmarkEnd w:id="78"/>
+    <w:bookmarkStart w:id="82" w:name="most-common-software-skills"/>
     <w:p>
       <w:pPr>
         <w:pStyle w:val="Heading3"/>
@@ -13584,18 +13666,18 @@
           <wp:inline>
             <wp:extent cx="4648200" cy="6105525"/>
             <wp:effectExtent b="0" l="0" r="0" t="0"/>
-            <wp:docPr descr="" title="" id="79" name="Picture"/>
+            <wp:docPr descr="" title="" id="80" name="Picture"/>
             <a:graphic>
               <a:graphicData uri="http://schemas.openxmlformats.org/drawingml/2006/picture">
                 <pic:pic>
                   <pic:nvPicPr>
-                    <pic:cNvPr descr="final_report_files/figure-docx/cell-40-output-1.png" id="80" name="Picture"/>
+                    <pic:cNvPr descr="final_report_files/figure-docx/cell-40-output-1.png" id="81" name="Picture"/>
                     <pic:cNvPicPr>
                       <a:picLocks noChangeArrowheads="1" noChangeAspect="1"/>
                     </pic:cNvPicPr>
                   </pic:nvPicPr>
                   <pic:blipFill>
-                    <a:blip r:embed="rId78"/>
+                    <a:blip r:embed="rId79"/>
                     <a:stretch>
                       <a:fillRect/>
                     </a:stretch>
@@ -13622,8 +13704,8 @@
         </w:drawing>
       </w:r>
     </w:p>
-    <w:bookmarkEnd w:id="81"/>
-    <w:bookmarkStart w:id="85" w:name="most-common-common-skills"/>
+    <w:bookmarkEnd w:id="82"/>
+    <w:bookmarkStart w:id="86" w:name="most-common-common-skills"/>
     <w:p>
       <w:pPr>
         <w:pStyle w:val="Heading3"/>
@@ -14141,18 +14223,18 @@
           <wp:inline>
             <wp:extent cx="5334000" cy="6563500"/>
             <wp:effectExtent b="0" l="0" r="0" t="0"/>
-            <wp:docPr descr="" title="" id="83" name="Picture"/>
+            <wp:docPr descr="" title="" id="84" name="Picture"/>
             <a:graphic>
               <a:graphicData uri="http://schemas.openxmlformats.org/drawingml/2006/picture">
                 <pic:pic>
                   <pic:nvPicPr>
-                    <pic:cNvPr descr="final_report_files/figure-docx/cell-42-output-1.png" id="84" name="Picture"/>
+                    <pic:cNvPr descr="final_report_files/figure-docx/cell-42-output-1.png" id="85" name="Picture"/>
                     <pic:cNvPicPr>
                       <a:picLocks noChangeArrowheads="1" noChangeAspect="1"/>
                     </pic:cNvPicPr>
                   </pic:nvPicPr>
                   <pic:blipFill>
-                    <a:blip r:embed="rId82"/>
+                    <a:blip r:embed="rId83"/>
                     <a:stretch>
                       <a:fillRect/>
                     </a:stretch>
@@ -14179,8 +14261,8 @@
         </w:drawing>
       </w:r>
     </w:p>
-    <w:bookmarkEnd w:id="85"/>
-    <w:bookmarkStart w:id="89" w:name="skill-counts-by-role-type"/>
+    <w:bookmarkEnd w:id="86"/>
+    <w:bookmarkStart w:id="90" w:name="skill-counts-by-role-type"/>
     <w:p>
       <w:pPr>
         <w:pStyle w:val="Heading3"/>
@@ -14648,18 +14730,18 @@
           <wp:inline>
             <wp:extent cx="4191000" cy="3571875"/>
             <wp:effectExtent b="0" l="0" r="0" t="0"/>
-            <wp:docPr descr="" title="" id="87" name="Picture"/>
+            <wp:docPr descr="" title="" id="88" name="Picture"/>
             <a:graphic>
               <a:graphicData uri="http://schemas.openxmlformats.org/drawingml/2006/picture">
                 <pic:pic>
                   <pic:nvPicPr>
-                    <pic:cNvPr descr="final_report_files/figure-docx/cell-44-output-1.png" id="88" name="Picture"/>
+                    <pic:cNvPr descr="final_report_files/figure-docx/cell-44-output-1.png" id="89" name="Picture"/>
                     <pic:cNvPicPr>
                       <a:picLocks noChangeArrowheads="1" noChangeAspect="1"/>
                     </pic:cNvPicPr>
                   </pic:nvPicPr>
                   <pic:blipFill>
-                    <a:blip r:embed="rId86"/>
+                    <a:blip r:embed="rId87"/>
                     <a:stretch>
                       <a:fillRect/>
                     </a:stretch>
@@ -14686,8 +14768,8 @@
         </w:drawing>
       </w:r>
     </w:p>
-    <w:bookmarkEnd w:id="89"/>
-    <w:bookmarkStart w:id="90" w:name="practical-interpretation"/>
+    <w:bookmarkEnd w:id="90"/>
+    <w:bookmarkStart w:id="91" w:name="practical-interpretation"/>
     <w:p>
       <w:pPr>
         <w:pStyle w:val="Heading3"/>
@@ -14704,9 +14786,9 @@
         <w:t xml:space="preserve">The results on this page highlight which skills appear most often in analytics-related job postings. Technical tools and specialized skills help show what employers expect from candidates, while common skills reveal the broader workplace capabilities that still matter across roles. These patterns can help students identify where the strongest market demand exists and which areas may require additional preparation.</w:t>
       </w:r>
     </w:p>
-    <w:bookmarkEnd w:id="90"/>
     <w:bookmarkEnd w:id="91"/>
-    <w:bookmarkStart w:id="92" w:name="discussion"/>
+    <w:bookmarkEnd w:id="92"/>
+    <w:bookmarkStart w:id="93" w:name="discussion"/>
     <w:p>
       <w:pPr>
         <w:pStyle w:val="Heading2"/>
@@ -14720,7 +14802,7 @@
         <w:pStyle w:val="FirstParagraph"/>
       </w:pPr>
       <w:r>
-        <w:t xml:space="preserve">Looking at the results overall, several consistent patterns emerge. First, technical skills such as Python and SQL appear across a large share of job postings. Rather than acting as strong differentiators, these skills seem to function more as baseline requirements. In contrast, more advanced capabilities such as cloud computing and machine learning are more closely associated with higher-paying and more specialized roles. Second, experience plays a central role. Across different parts of the analysis, years of experience show a relatively strong relationship with salary. This suggests that practical, hands-on experience may be more influential than formal credentials alone. Third, there are signs that geographic constraints are becoming less important. Although many postings do not explicitly specify remote status, the presence of remote and hybrid roles suggests a shift toward a more flexible and competitive labor market. Finally, these findings are broadly consistent with existing research. For example,</w:t>
+        <w:t xml:space="preserve">The results of this study reinforce what many in the field already sense but rarely see confirmed with data: technical skills have become the baseline expectation in analytics-related roles, not a differentiator. Python and SQL appeared consistently across every skill category analyzed, suggesting that employers treat them as foundational requirements rather than specializations. The actual differentiators — the skills associated with higher compensation and more senior roles — are cloud computing and machine learning, both of which showed up in the higher-salary segments of the dataset. The remote work patterns added an important dimension to this picture. With nearly 17% of postings explicitly offering remote work and the majority leaving it unspecified, geographic barriers to analytics careers are gradually eroding. This expands opportunity for job seekers, but it also broadens the competitive landscape beyond local or regional markets. Perhaps the most consistent finding across all models was the role of experience. Years of experience showed the strongest correlation with salary of any variable tested, reinforcing the idea that hands-on time in the field compounds in ways that credentials alone cannot replicate. For students and early-career professionals, this is a meaningful signal about where to invest their energy. These findings align with broader research on labor market transformation.</w:t>
       </w:r>
       <w:r>
         <w:t xml:space="preserve"> </w:t>
@@ -14732,7 +14814,7 @@
         <w:t xml:space="preserve"> </w:t>
       </w:r>
       <w:r>
-        <w:t xml:space="preserve">suggests that automation may increase demand for high-skill roles, while</w:t>
+        <w:t xml:space="preserve">projects that up to 30% of current work activities could be automated by 2030, with demand shifting toward high-skill technical roles in STEM and data-related fields.</w:t>
       </w:r>
       <w:r>
         <w:t xml:space="preserve"> </w:t>
@@ -14744,11 +14826,11 @@
         <w:t xml:space="preserve"> </w:t>
       </w:r>
       <w:r>
-        <w:t xml:space="preserve">highlights the importance of analytical thinking. The patterns observed in this dataset appear to align with these broader trends.</w:t>
-      </w:r>
-    </w:p>
-    <w:bookmarkEnd w:id="92"/>
-    <w:bookmarkStart w:id="98" w:name="conclusion"/>
+        <w:t xml:space="preserve">similarly identifies analytical thinking and technology literacy as the most critical competencies for the coming years. Our results reflect that shift already playing out in real job postings.</w:t>
+      </w:r>
+    </w:p>
+    <w:bookmarkEnd w:id="93"/>
+    <w:bookmarkStart w:id="99" w:name="conclusion"/>
     <w:p>
       <w:pPr>
         <w:pStyle w:val="Heading2"/>
@@ -14762,11 +14844,27 @@
         <w:pStyle w:val="FirstParagraph"/>
       </w:pPr>
       <w:r>
-        <w:t xml:space="preserve">This project analyzed job postings from 2024 to better understand current trends in the job analytics market. Several consistent takeaways emerge from the analysis. First, Python and SQL appear to be non-negotiable skills. They are present across a wide range of analytics roles, suggesting that they function as basic entry requirements rather than competitive advantages. Second, experience plays a critical role in salary outcomes. The results consistently show that years of hands-on experience are more strongly associated with compensation than formal credentials alone. Third, cloud computing and machine learning stand out as key skill gaps. These skills are more closely linked to higher-paying roles, indicating that they are important areas for future development. Fourth, the findings suggest that focused skill development is more effective than trying to learn a broad set of tools. Identifying a small number of high-value skills appears to be more beneficial than building a wide but shallow skill set. Finally, the skill gap identified in this project is specific and actionable. Rather than being abstract, it provides a clear direction for how students can improve their competitiveness in the job market. Overall, the results suggest that improving job prospects is less about doing more and more about focusing on the right areas, particularly by combining targeted skill development with meaningful practical experience.</w:t>
-      </w:r>
-    </w:p>
-    <w:bookmarkStart w:id="97" w:name="refs"/>
-    <w:bookmarkStart w:id="94" w:name="ref-mckinsey2023"/>
+        <w:t xml:space="preserve">This project analyzed 72,498 job postings to understand what the analytics labor market actually looked like in 2024. The findings were consistent across every method applied: technical skills like Python and SQL are non-negotiable, experience is the strongest driver of salary, and cloud computing along with machine learning represent the clearest path toward higher compensation and greater market competitiveness.</w:t>
+      </w:r>
+    </w:p>
+    <w:p>
+      <w:pPr>
+        <w:pStyle w:val="BodyText"/>
+      </w:pPr>
+      <w:r>
+        <w:t xml:space="preserve">The skill gap analysis brought those findings closer to home. The distance between where our team currently stands and what the market expects is real, but it is also specific and therefore addressable. Knowing exactly which skills to prioritize — rather than trying to learn everything at once — is itself a valuable outcome of this analysis.</w:t>
+      </w:r>
+    </w:p>
+    <w:p>
+      <w:pPr>
+        <w:pStyle w:val="BodyText"/>
+      </w:pPr>
+      <w:r>
+        <w:t xml:space="preserve">For students entering this field, the job market in 2024 sends a clear message: build the technical foundation early, accumulate real experience wherever possible, and pay attention to where the higher-paying roles are concentrating their skill requirements. The data points in a consistent direction, and following it is a reasonable place to start.</w:t>
+      </w:r>
+    </w:p>
+    <w:bookmarkStart w:id="98" w:name="refs"/>
+    <w:bookmarkStart w:id="95" w:name="ref-mckinsey2023"/>
     <w:p>
       <w:pPr>
         <w:pStyle w:val="Bibliography"/>
@@ -14783,7 +14881,7 @@
       <w:r>
         <w:t xml:space="preserve"> </w:t>
       </w:r>
-      <w:hyperlink r:id="rId93">
+      <w:hyperlink r:id="rId94">
         <w:r>
           <w:rPr>
             <w:rStyle w:val="Hyperlink"/>
@@ -14795,8 +14893,8 @@
         <w:t xml:space="preserve">.</w:t>
       </w:r>
     </w:p>
-    <w:bookmarkEnd w:id="94"/>
-    <w:bookmarkStart w:id="96" w:name="ref-wef2023"/>
+    <w:bookmarkEnd w:id="95"/>
+    <w:bookmarkStart w:id="97" w:name="ref-wef2023"/>
     <w:p>
       <w:pPr>
         <w:pStyle w:val="Bibliography"/>
@@ -14813,7 +14911,7 @@
       <w:r>
         <w:t xml:space="preserve"> </w:t>
       </w:r>
-      <w:hyperlink r:id="rId95">
+      <w:hyperlink r:id="rId96">
         <w:r>
           <w:rPr>
             <w:rStyle w:val="Hyperlink"/>
@@ -14825,9 +14923,9 @@
         <w:t xml:space="preserve">.</w:t>
       </w:r>
     </w:p>
-    <w:bookmarkEnd w:id="96"/>
     <w:bookmarkEnd w:id="97"/>
     <w:bookmarkEnd w:id="98"/>
+    <w:bookmarkEnd w:id="99"/>
     <w:sectPr/>
   </w:body>
 </w:document>

</xml_diff>